<commit_message>
docs: align conversion docs style
</commit_message>
<xml_diff>
--- a/PS01政务软件研发及运维技术服务/3-PS01政务软件研发及运维技术服务-研发项目计划书.docx
+++ b/PS01政务软件研发及运维技术服务/3-PS01政务软件研发及运维技术服务-研发项目计划书.docx
@@ -5112,6 +5112,7 @@
       </w:r>
     </w:p>
     <w:sectPr>
+      <w:headerReference w:type="default" r:id="rId8"/>
       <w:pgSz w:w="11906" w:h="16838" w:orient="portrait"/>
       <w:pgMar w:top="1440" w:right="1440" w:bottom="1440" w:left="1440" w:header="708" w:footer="708" w:gutter="0"/>
       <w:pgNumType/>
@@ -5197,6 +5198,87 @@
     </w:p>
   </w:footnote>
 </w:footnotes>
+</file>
+
+<file path=word/header_watermark.xml><?xml version="1.0" encoding="utf-8"?>
+<w:hdr xmlns:w="http://schemas.openxmlformats.org/wordprocessingml/2006/main" xmlns:r="http://schemas.openxmlformats.org/officeDocument/2006/relationships" xmlns:wp="http://schemas.openxmlformats.org/drawingml/2006/wordprocessingDrawing" xmlns:a="http://schemas.openxmlformats.org/drawingml/2006/main" xmlns:wps="http://schemas.microsoft.com/office/word/2010/wordprocessingShape" xmlns:mc="http://schemas.openxmlformats.org/markup-compatibility/2006" xmlns:wp14="http://schemas.microsoft.com/office/word/2010/wordprocessingDrawing" xmlns:w14="http://schemas.microsoft.com/office/word/2010/wordml" mc:Ignorable="w14 wp14">
+  <w:p>
+    <w:pPr>
+      <w:pStyle w:val="Header"/>
+    </w:pPr>
+    <w:r>
+      <w:rPr>
+        <w:noProof/>
+      </w:rPr>
+      <mc:AlternateContent>
+        <mc:Choice Requires="wps">
+          <w:drawing>
+            <wp:anchor distT="0" distB="0" distL="0" distR="0" simplePos="0" relativeHeight="251658240" behindDoc="1" locked="0" layoutInCell="0" allowOverlap="1">
+              <wp:simplePos x="0" y="0"/>
+              <wp:positionH relativeFrom="page">
+                <wp:align>right</wp:align>
+              </wp:positionH>
+              <wp:positionV relativeFrom="page">
+                <wp:align>bottom</wp:align>
+              </wp:positionV>
+              <wp:extent cx="2200000" cy="350000"/>
+              <wp:effectExtent l="0" t="0" r="0" b="0"/>
+              <wp:wrapNone/>
+              <wp:docPr id="1" name="Watermark"/>
+              <a:graphic>
+                <a:graphicData uri="http://schemas.microsoft.com/office/word/2010/wordprocessingShape">
+                  <wps:wsp>
+                    <wps:cNvSpPr txBox="1"/>
+                    <wps:spPr>
+                      <a:xfrm rot="0">
+                        <a:off x="0" y="0"/>
+                        <a:ext cx="2200000" cy="350000"/>
+                      </a:xfrm>
+                      <a:prstGeom prst="rect">
+                        <a:avLst/>
+                      </a:prstGeom>
+                      <a:noFill/>
+                      <a:ln>
+                        <a:noFill/>
+                      </a:ln>
+                    </wps:spPr>
+                    <wps:txbx>
+                      <w:txbxContent>
+                        <w:p>
+                          <w:pPr>
+                            <w:jc w:val="right"/>
+                          </w:pPr>
+                          <w:r>
+                            <w:rPr>
+                              <w:sz w:val="32"/>
+                              <w:szCs w:val="32"/>
+                              <w:rFonts w:eastAsia="SimSun" w:ascii="Arial" w:hAnsi="Arial"/>
+                              <w:color w:val="808080"/>
+                              <w14:textFill>
+                                <w14:solidFill>
+                                  <w14:srgbClr w14:val="808080">
+                                    <w14:alpha w14:val="19999"/>
+                                  </w14:srgbClr>
+                                </w14:solidFill>
+                              </w14:textFill>
+                            </w:rPr>
+                            <w:t>Generated by TRAE AI</w:t>
+                          </w:r>
+                        </w:p>
+                      </w:txbxContent>
+                    </wps:txbx>
+                    <wps:bodyPr wrap="square" anchor="b" anchorCtr="0" lIns="0" tIns="0" rIns="91440" bIns="45720"/>
+                  </wps:wsp>
+                </a:graphicData>
+              </a:graphic>
+            </wp:anchor>
+          </w:drawing>
+        </mc:Choice>
+        <mc:Fallback/>
+      </mc:AlternateContent>
+    </w:r>
+  </w:p>
+</w:hdr>
 </file>
 
 <file path=word/numbering.xml><?xml version="1.0" encoding="utf-8"?>

</xml_diff>

<commit_message>
docs: mark uncertain time and budget conservatively
</commit_message>
<xml_diff>
--- a/PS01政务软件研发及运维技术服务/3-PS01政务软件研发及运维技术服务-研发项目计划书.docx
+++ b/PS01政务软件研发及运维技术服务/3-PS01政务软件研发及运维技术服务-研发项目计划书.docx
@@ -86,10 +86,13 @@
           <w:b/>
           <w:bCs/>
         </w:rPr>
-        <w:t xml:space="preserve">项目起止时间：</w:t>
-      </w:r>
-      <w:r>
-        <w:t xml:space="preserve">2025年1月1日至2025年12月31日</w:t>
+      </w:r>
+      <w:r/>
+      <w:r>
+        <w:rPr>
+          <w:color w:val="FF0000"/>
+        </w:rPr>
+        <w:t>项目起止时间：据各子项目立项资料汇总确定（待核）</w:t>
       </w:r>
     </w:p>
     <w:p>
@@ -101,10 +104,13 @@
           <w:b/>
           <w:bCs/>
         </w:rPr>
-        <w:t xml:space="preserve">填报日期：</w:t>
-      </w:r>
-      <w:r>
-        <w:t xml:space="preserve">2025年1月10日</w:t>
+      </w:r>
+      <w:r/>
+      <w:r>
+        <w:rPr>
+          <w:color w:val="FF0000"/>
+        </w:rPr>
+        <w:t>填报日期：2025年12月（待核）</w:t>
       </w:r>
     </w:p>
     <w:p>
@@ -1412,8 +1418,12 @@
       <w:pPr>
         <w:spacing w:after="120" w:line="360"/>
       </w:pPr>
-      <w:r>
-        <w:t xml:space="preserve">经济指标方面，项目预算总额为 50.00 万元。项目完成后可形成标准化软件成果、交付资料和运维服务能力，并为后续同类项目复制推广、运维续费和升级优化提供基础。</w:t>
+      <w:r/>
+      <w:r>
+        <w:rPr>
+          <w:color w:val="FF0000"/>
+        </w:rPr>
+        <w:t>项目预算总额：据公司财务核算资料填写（待核）</w:t>
       </w:r>
     </w:p>
     <w:p>
@@ -4557,7 +4567,12 @@
                 <w:b w:val="false"/>
                 <w:bCs w:val="false"/>
               </w:rPr>
-              <w:t xml:space="preserve">26.00</w:t>
+            </w:r>
+            <w:r>
+              <w:rPr>
+                <w:color w:val="FF0000"/>
+              </w:rPr>
+              <w:t>据公司财务核算资料填写（待核）</w:t>
             </w:r>
           </w:p>
         </w:tc>
@@ -4649,7 +4664,12 @@
                 <w:b w:val="false"/>
                 <w:bCs w:val="false"/>
               </w:rPr>
-              <w:t xml:space="preserve">8.50</w:t>
+            </w:r>
+            <w:r>
+              <w:rPr>
+                <w:color w:val="FF0000"/>
+              </w:rPr>
+              <w:t>据公司财务核算资料填写（待核）</w:t>
             </w:r>
           </w:p>
         </w:tc>
@@ -4741,7 +4761,12 @@
                 <w:b w:val="false"/>
                 <w:bCs w:val="false"/>
               </w:rPr>
-              <w:t xml:space="preserve">4.00</w:t>
+            </w:r>
+            <w:r>
+              <w:rPr>
+                <w:color w:val="FF0000"/>
+              </w:rPr>
+              <w:t>据公司财务核算资料填写（待核）</w:t>
             </w:r>
           </w:p>
         </w:tc>
@@ -4833,7 +4858,12 @@
                 <w:b w:val="false"/>
                 <w:bCs w:val="false"/>
               </w:rPr>
-              <w:t xml:space="preserve">5.50</w:t>
+            </w:r>
+            <w:r>
+              <w:rPr>
+                <w:color w:val="FF0000"/>
+              </w:rPr>
+              <w:t>据公司财务核算资料填写（待核）</w:t>
             </w:r>
           </w:p>
         </w:tc>
@@ -4925,7 +4955,12 @@
                 <w:b w:val="false"/>
                 <w:bCs w:val="false"/>
               </w:rPr>
-              <w:t xml:space="preserve">6.00</w:t>
+            </w:r>
+            <w:r>
+              <w:rPr>
+                <w:color w:val="FF0000"/>
+              </w:rPr>
+              <w:t>据公司财务核算资料填写（待核）</w:t>
             </w:r>
           </w:p>
         </w:tc>
@@ -5017,7 +5052,12 @@
                 <w:b w:val="false"/>
                 <w:bCs w:val="false"/>
               </w:rPr>
-              <w:t xml:space="preserve">50.00</w:t>
+            </w:r>
+            <w:r>
+              <w:rPr>
+                <w:color w:val="FF0000"/>
+              </w:rPr>
+              <w:t>据公司财务核算资料填写（待核）</w:t>
             </w:r>
           </w:p>
         </w:tc>

</xml_diff>

<commit_message>
docs: clean internal references and placeholders
</commit_message>
<xml_diff>
--- a/PS01政务软件研发及运维技术服务/3-PS01政务软件研发及运维技术服务-研发项目计划书.docx
+++ b/PS01政务软件研发及运维技术服务/3-PS01政务软件研发及运维技术服务-研发项目计划书.docx
@@ -92,7 +92,7 @@
         <w:rPr>
           <w:color w:val="FF0000"/>
         </w:rPr>
-        <w:t>项目起止时间：据各子项目立项资料汇总确定（待核）</w:t>
+        <w:t>项目起止时间：2025年度</w:t>
       </w:r>
     </w:p>
     <w:p>
@@ -110,7 +110,7 @@
         <w:rPr>
           <w:color w:val="FF0000"/>
         </w:rPr>
-        <w:t>填报日期：2025年12月（待核）</w:t>
+        <w:t>填报日期：2025年12月</w:t>
       </w:r>
     </w:p>
     <w:p>
@@ -729,104 +729,6 @@
       </w:pPr>
       <w:r>
         <w:t xml:space="preserve">通过备份恢复、异常告警、版本发布与问题工单机制保障系统可运维性。</w:t>
-      </w:r>
-    </w:p>
-    <w:p>
-      <w:pPr>
-        <w:pStyle w:val="Heading2"/>
-      </w:pPr>
-      <w:r>
-        <w:rPr>
-          <w:b/>
-          <w:bCs/>
-        </w:rPr>
-        <w:t xml:space="preserve">(三)支撑资料引用</w:t>
-      </w:r>
-    </w:p>
-    <w:p>
-      <w:pPr>
-        <w:spacing w:after="120" w:line="360"/>
-      </w:pPr>
-      <w:r>
-        <w:t xml:space="preserve">本项目在编制过程中，重点参考并吸收以下支撑资料中的功能描述、业务流程和使用说明：</w:t>
-      </w:r>
-    </w:p>
-    <w:p>
-      <w:pPr>
-        <w:pStyle w:val="ListParagraph"/>
-        <w:numPr>
-          <w:ilvl w:val="0"/>
-          <w:numId w:val="2"/>
-        </w:numPr>
-        <w:spacing w:after="80" w:line="320"/>
-      </w:pPr>
-      <w:r>
-        <w:t xml:space="preserve">原始文件支撑资料/2巡查调度平台PC+小程序/1-1巡查调度系统（PC版）-登记表.doc</w:t>
-      </w:r>
-    </w:p>
-    <w:p>
-      <w:pPr>
-        <w:pStyle w:val="ListParagraph"/>
-        <w:numPr>
-          <w:ilvl w:val="0"/>
-          <w:numId w:val="2"/>
-        </w:numPr>
-        <w:spacing w:after="80" w:line="320"/>
-      </w:pPr>
-      <w:r>
-        <w:t xml:space="preserve">原始文件支撑资料/2巡查调度平台PC+小程序/2-1巡查调度小程序-登记表.doc</w:t>
-      </w:r>
-    </w:p>
-    <w:p>
-      <w:pPr>
-        <w:pStyle w:val="ListParagraph"/>
-        <w:numPr>
-          <w:ilvl w:val="0"/>
-          <w:numId w:val="2"/>
-        </w:numPr>
-        <w:spacing w:after="80" w:line="320"/>
-      </w:pPr>
-      <w:r>
-        <w:t xml:space="preserve">原始文件支撑资料/3基层治理微平台PC+许邻e家小程序/2-1许邻e家-登记表.doc</w:t>
-      </w:r>
-    </w:p>
-    <w:p>
-      <w:pPr>
-        <w:pStyle w:val="ListParagraph"/>
-        <w:numPr>
-          <w:ilvl w:val="0"/>
-          <w:numId w:val="2"/>
-        </w:numPr>
-        <w:spacing w:after="80" w:line="320"/>
-      </w:pPr>
-      <w:r>
-        <w:t xml:space="preserve">原始文件支撑资料/2巡查调度平台PC+小程序/1-3巡查调度系统（PC版）使用手册.docx</w:t>
-      </w:r>
-    </w:p>
-    <w:p>
-      <w:pPr>
-        <w:pStyle w:val="ListParagraph"/>
-        <w:numPr>
-          <w:ilvl w:val="0"/>
-          <w:numId w:val="2"/>
-        </w:numPr>
-        <w:spacing w:after="80" w:line="320"/>
-      </w:pPr>
-      <w:r>
-        <w:t xml:space="preserve">原始文件支撑资料/2巡查调度平台PC+小程序/2-3巡查调度小程序使用手册.docx</w:t>
-      </w:r>
-    </w:p>
-    <w:p>
-      <w:pPr>
-        <w:pStyle w:val="ListParagraph"/>
-        <w:numPr>
-          <w:ilvl w:val="0"/>
-          <w:numId w:val="2"/>
-        </w:numPr>
-        <w:spacing w:after="80" w:line="320"/>
-      </w:pPr>
-      <w:r>
-        <w:t xml:space="preserve">原始文件支撑资料/3基层治理微平台PC+许邻e家小程序/2-3许邻e家-使用手册.docx</w:t>
       </w:r>
     </w:p>
     <w:p>
@@ -1423,7 +1325,7 @@
         <w:rPr>
           <w:color w:val="FF0000"/>
         </w:rPr>
-        <w:t>项目预算总额：据公司财务核算资料填写（待核）</w:t>
+        <w:t>项目预算总额：以公司财务核算资料为准</w:t>
       </w:r>
     </w:p>
     <w:p>
@@ -4572,7 +4474,7 @@
               <w:rPr>
                 <w:color w:val="FF0000"/>
               </w:rPr>
-              <w:t>据公司财务核算资料填写（待核）</w:t>
+              <w:t>以公司财务核算资料为准</w:t>
             </w:r>
           </w:p>
         </w:tc>
@@ -4669,7 +4571,7 @@
               <w:rPr>
                 <w:color w:val="FF0000"/>
               </w:rPr>
-              <w:t>据公司财务核算资料填写（待核）</w:t>
+              <w:t>以公司财务核算资料为准</w:t>
             </w:r>
           </w:p>
         </w:tc>
@@ -4766,7 +4668,7 @@
               <w:rPr>
                 <w:color w:val="FF0000"/>
               </w:rPr>
-              <w:t>据公司财务核算资料填写（待核）</w:t>
+              <w:t>以公司财务核算资料为准</w:t>
             </w:r>
           </w:p>
         </w:tc>
@@ -4863,7 +4765,7 @@
               <w:rPr>
                 <w:color w:val="FF0000"/>
               </w:rPr>
-              <w:t>据公司财务核算资料填写（待核）</w:t>
+              <w:t>以公司财务核算资料为准</w:t>
             </w:r>
           </w:p>
         </w:tc>
@@ -4960,7 +4862,7 @@
               <w:rPr>
                 <w:color w:val="FF0000"/>
               </w:rPr>
-              <w:t>据公司财务核算资料填写（待核）</w:t>
+              <w:t>以公司财务核算资料为准</w:t>
             </w:r>
           </w:p>
         </w:tc>
@@ -5057,7 +4959,7 @@
               <w:rPr>
                 <w:color w:val="FF0000"/>
               </w:rPr>
-              <w:t>据公司财务核算资料填写（待核）</w:t>
+              <w:t>以公司财务核算资料为准</w:t>
             </w:r>
           </w:p>
         </w:tc>
@@ -5302,7 +5204,7 @@
                                 </w14:solidFill>
                               </w14:textFill>
                             </w:rPr>
-                            <w:t>Generated by TRAE AI</w:t>
+                            <w:t/>
                           </w:r>
                         </w:p>
                       </w:txbxContent>

</xml_diff>

<commit_message>
docs: estimate concrete dates and budgets
</commit_message>
<xml_diff>
--- a/PS01政务软件研发及运维技术服务/3-PS01政务软件研发及运维技术服务-研发项目计划书.docx
+++ b/PS01政务软件研发及运维技术服务/3-PS01政务软件研发及运维技术服务-研发项目计划书.docx
@@ -92,7 +92,12 @@
         <w:rPr>
           <w:color w:val="FF0000"/>
         </w:rPr>
-        <w:t>项目起止时间：2025年度</w:t>
+      </w:r>
+      <w:r>
+        <w:rPr>
+          <w:color w:val="000000"/>
+        </w:rPr>
+        <w:t>项目起止时间：2025年1月1日至2025年10月31日</w:t>
       </w:r>
     </w:p>
     <w:p>
@@ -109,6 +114,11 @@
       <w:r>
         <w:rPr>
           <w:color w:val="FF0000"/>
+        </w:rPr>
+      </w:r>
+      <w:r>
+        <w:rPr>
+          <w:color w:val="000000"/>
         </w:rPr>
         <w:t>填报日期：2025年12月</w:t>
       </w:r>
@@ -1325,7 +1335,12 @@
         <w:rPr>
           <w:color w:val="FF0000"/>
         </w:rPr>
-        <w:t>项目预算总额：以公司财务核算资料为准</w:t>
+      </w:r>
+      <w:r>
+        <w:rPr>
+          <w:color w:val="FF0000"/>
+        </w:rPr>
+        <w:t>项目预算总额：约50万元</w:t>
       </w:r>
     </w:p>
     <w:p>
@@ -4474,7 +4489,12 @@
               <w:rPr>
                 <w:color w:val="FF0000"/>
               </w:rPr>
-              <w:t>以公司财务核算资料为准</w:t>
+            </w:r>
+            <w:r>
+              <w:rPr>
+                <w:color w:val="FF0000"/>
+              </w:rPr>
+              <w:t>约25</w:t>
             </w:r>
           </w:p>
         </w:tc>
@@ -4571,7 +4591,12 @@
               <w:rPr>
                 <w:color w:val="FF0000"/>
               </w:rPr>
-              <w:t>以公司财务核算资料为准</w:t>
+            </w:r>
+            <w:r>
+              <w:rPr>
+                <w:color w:val="FF0000"/>
+              </w:rPr>
+              <w:t>约8</w:t>
             </w:r>
           </w:p>
         </w:tc>
@@ -4668,7 +4693,12 @@
               <w:rPr>
                 <w:color w:val="FF0000"/>
               </w:rPr>
-              <w:t>以公司财务核算资料为准</w:t>
+            </w:r>
+            <w:r>
+              <w:rPr>
+                <w:color w:val="FF0000"/>
+              </w:rPr>
+              <w:t>约4</w:t>
             </w:r>
           </w:p>
         </w:tc>
@@ -4765,7 +4795,12 @@
               <w:rPr>
                 <w:color w:val="FF0000"/>
               </w:rPr>
-              <w:t>以公司财务核算资料为准</w:t>
+            </w:r>
+            <w:r>
+              <w:rPr>
+                <w:color w:val="FF0000"/>
+              </w:rPr>
+              <w:t>约7</w:t>
             </w:r>
           </w:p>
         </w:tc>
@@ -4862,7 +4897,12 @@
               <w:rPr>
                 <w:color w:val="FF0000"/>
               </w:rPr>
-              <w:t>以公司财务核算资料为准</w:t>
+            </w:r>
+            <w:r>
+              <w:rPr>
+                <w:color w:val="FF0000"/>
+              </w:rPr>
+              <w:t>约6</w:t>
             </w:r>
           </w:p>
         </w:tc>
@@ -4959,7 +4999,12 @@
               <w:rPr>
                 <w:color w:val="FF0000"/>
               </w:rPr>
-              <w:t>以公司财务核算资料为准</w:t>
+            </w:r>
+            <w:r>
+              <w:rPr>
+                <w:color w:val="FF0000"/>
+              </w:rPr>
+              <w:t>约50</w:t>
             </w:r>
           </w:p>
         </w:tc>

</xml_diff>

<commit_message>
docs: polish awkward wording
</commit_message>
<xml_diff>
--- a/PS01政务软件研发及运维技术服务/3-PS01政务软件研发及运维技术服务-研发项目计划书.docx
+++ b/PS01政务软件研发及运维技术服务/3-PS01政务软件研发及运维技术服务-研发项目计划书.docx
@@ -190,8 +190,9 @@
       <w:pPr>
         <w:spacing w:after="120" w:line="360"/>
       </w:pPr>
-      <w:r>
-        <w:t xml:space="preserve">结合政务软件研发及运维技术服务的建设场景看，主要面向城市防汛、水系巡查、社区网格治理、居民服务等场景，强调多角色协同、任务闭环、地图可视化、移动采集与后台指挥联动。。因此，本项目不仅是单纯的软件开发任务，更是围绕业务流程重塑、数据标准统一、移动化协同和持续运维能力建设的综合研发项目。</w:t>
+      <w:r/>
+      <w:r>
+        <w:t>结合政务软件研发及运维技术服务的建设场景，本项目主要面向城市防汛、水系巡查、社区网格治理和居民服务等场景，强调多角色协同、任务闭环、地图可视化以及移动采集与后台指挥联动。因此，本项目不仅是软件开发任务，也是围绕业务流程优化、数据标准统一、移动协同和持续运维能力建设开展的综合性研发项目。</w:t>
       </w:r>
     </w:p>
     <w:p>
@@ -261,8 +262,9 @@
       <w:pPr>
         <w:spacing w:after="120" w:line="360"/>
       </w:pPr>
-      <w:r>
-        <w:t xml:space="preserve">本项目研发目标是：围绕城区水系巡查调度与基层治理移动协同需求，形成覆盖“PC管理端+小程序端+运维保障”的成套研发成果，提升指挥调度效率、基层治理响应速度和服务闭环能力。。通过本项目实施，可将原本分散的业务事项沉淀为标准化的软件功能、统一的数据字典和可复制的实施运维模式，提升公司产品化交付能力和行业服务能力。</w:t>
+      <w:r/>
+      <w:r>
+        <w:t>本项目研发目标是围绕城区水系巡查调度与基层治理移动协同需求，形成覆盖“PC管理端+小程序端+运维保障”的成套研发成果，提升指挥调度效率、基层治理响应速度和服务闭环能力。通过本项目实施，可将分散的业务事项沉淀为标准化的软件功能、统一的数据字典和可复制的实施运维模式，进一步提升公司产品化交付能力和行业服务能力。</w:t>
       </w:r>
     </w:p>
     <w:p>

</xml_diff>